<commit_message>
Update Bible resource content for multiple languages for 2026-05-26 release
</commit_message>
<xml_diff>
--- a/arb/docx/029.content.docx
+++ b/arb/docx/029.content.docx
@@ -311,7 +311,19 @@
         <w:rPr>
           <w:lang w:val="ar_AE" w:bidi="ar_AE"/>
         </w:rPr>
-        <w:t>. هذا لا يعني كتابة خمس وصايا على كلِّ لوحٍ؛ بل كُتِبَتْ الوصايا العشر كلها مَرَّتَيْن على لَوْحَيْن، اللَّوْح الأول ينتمي إلى الله المُشَرِّع، والثاني يَخُصُّ إسرائيل المتلقِّي. ترتبط الوصايا بمجالَيْن أساسيَّيْن في الحياة البشرية: تهتم الوصايا الخمس الأولى بالعلاقة مع الله، أما الخمس الأخيرة فهي مَعْنِيَّة بالعلاقات البشرية. أُعْطِيَتْ الوصايا أولاً لإسرائيل وقت قَطْعِ العهد في جبل سيناء، أي بعد وقتٍ قصيرٍ من الخروج من مصر. ومع أن تاريخ العهد السينائي لا يمكن تحديده بدقة، لكن على الأرجح كان في سنة 1290 ق.م تقريبًا. ولفهم الوصايا، من الضروري أولاً فهم السياق الذي أُعْطِيَتْ فيه</w:t>
+        <w:t xml:space="preserve">. هذا لا يعني كتابة خمس وصايا على كلِّ لوحٍ؛ بل كُتِبَتْ الوصايا العشر كلها مَرَّتَيْن على لَوْحَيْن، اللَّوْح الأول ينتمي إلى الله المُشَرِّع، والثاني يَخُصُّ إسرائيل المتلقِّي. </w:t>
+      </w:r>
+      <w:r>
+        <w:rPr>
+          <w:lang w:val="ar_AE" w:bidi="ar_AE"/>
+        </w:rPr>
+        <w:t>تتعلّق الوصايا بمجالين أساسيين من حياة الإنسان: فالوصايا الأربع الأولى تختصّ بعلاقة الإنسان بالله، أمّا الوصايا الست الأخيرة فتختصّ بعلاقات البشر بعضهم ببعض</w:t>
+      </w:r>
+      <w:r>
+        <w:rPr>
+          <w:lang w:val="ar_AE" w:bidi="ar_AE"/>
+        </w:rPr>
+        <w:t>. أُعْطِيَتْ الوصايا أولاً لإسرائيل وقت قَطْعِ العهد في جبل سيناء، أي بعد وقتٍ قصيرٍ من الخروج من مصر. ومع أن تاريخ العهد السينائي لا يمكن تحديده بدقة، لكن على الأرجح كان في سنة 1290 ق.م تقريبًا. ولفهم الوصايا، من الضروري أولاً فهم السياق الذي أُعْطِيَتْ فيه</w:t>
       </w:r>
       <w:r>
         <w:rPr>

</xml_diff>